<commit_message>
docs: sync final report fields
</commit_message>
<xml_diff>
--- a/docs/《数字图像处理与机器视觉课程设计报告_人脸图像预处理及人脸检测系统设计》.docx
+++ b/docs/《数字图像处理与机器视觉课程设计报告_人脸图像预处理及人脸检测系统设计》.docx
@@ -15,8 +15,6 @@
           <w:szCs w:val="96"/>
         </w:rPr>
       </w:pPr>
-      <w:bookmarkStart w:id="34" w:name="_GoBack"/>
-      <w:bookmarkEnd w:id="34"/>
       <w:r>
         <w:rPr>
           <w:rFonts w:hint="eastAsia" w:ascii="华文行楷" w:eastAsia="华文行楷"/>
@@ -381,7 +379,7 @@
             <w:pPr>
               <w:jc w:val="center"/>
               <w:rPr>
-                <w:rFonts w:hint="eastAsia" w:ascii="宋体" w:hAnsi="宋体" w:eastAsia="宋体" w:cs="宋体"/>
+                <w:rFonts w:hint="default" w:ascii="宋体" w:hAnsi="宋体" w:eastAsia="宋体" w:cs="宋体"/>
                 <w:b w:val="0"/>
                 <w:bCs w:val="0"/>
                 <w:color w:val="000000"/>
@@ -392,6 +390,20 @@
                 <w:lang w:val="en-US" w:eastAsia="zh-CN"/>
               </w:rPr>
             </w:pPr>
+            <w:r>
+              <w:rPr>
+                <w:rFonts w:hint="eastAsia" w:ascii="宋体" w:hAnsi="宋体" w:cs="宋体"/>
+                <w:b w:val="0"/>
+                <w:bCs w:val="0"/>
+                <w:color w:val="000000"/>
+                <w:sz w:val="24"/>
+                <w:szCs w:val="24"/>
+                <w:u w:val="single"/>
+                <w:vertAlign w:val="baseline"/>
+                <w:lang w:val="en-US" w:eastAsia="zh-CN"/>
+              </w:rPr>
+              <w:t>20234080415</w:t>
+            </w:r>
           </w:p>
         </w:tc>
         <w:tc>
@@ -411,7 +423,7 @@
             <w:pPr>
               <w:jc w:val="center"/>
               <w:rPr>
-                <w:rFonts w:hint="eastAsia" w:ascii="宋体" w:hAnsi="宋体" w:eastAsia="宋体" w:cs="宋体"/>
+                <w:rFonts w:hint="default" w:ascii="宋体" w:hAnsi="宋体" w:eastAsia="宋体" w:cs="宋体"/>
                 <w:b w:val="0"/>
                 <w:bCs w:val="0"/>
                 <w:color w:val="000000"/>
@@ -422,6 +434,20 @@
                 <w:lang w:val="en-US" w:eastAsia="zh-CN"/>
               </w:rPr>
             </w:pPr>
+            <w:r>
+              <w:rPr>
+                <w:rFonts w:hint="eastAsia" w:ascii="宋体" w:hAnsi="宋体" w:cs="宋体"/>
+                <w:b w:val="0"/>
+                <w:bCs w:val="0"/>
+                <w:color w:val="000000"/>
+                <w:sz w:val="24"/>
+                <w:szCs w:val="24"/>
+                <w:u w:val="single"/>
+                <w:vertAlign w:val="baseline"/>
+                <w:lang w:val="en-US" w:eastAsia="zh-CN"/>
+              </w:rPr>
+              <w:t>唐宇正</w:t>
+            </w:r>
           </w:p>
         </w:tc>
         <w:tc>
@@ -441,7 +467,7 @@
             <w:pPr>
               <w:jc w:val="center"/>
               <w:rPr>
-                <w:rFonts w:hint="eastAsia" w:ascii="宋体" w:hAnsi="宋体" w:eastAsia="宋体" w:cs="宋体"/>
+                <w:rFonts w:hint="default" w:ascii="宋体" w:hAnsi="宋体" w:eastAsia="宋体" w:cs="宋体"/>
                 <w:b w:val="0"/>
                 <w:bCs w:val="0"/>
                 <w:color w:val="000000"/>
@@ -452,6 +478,20 @@
                 <w:lang w:val="en-US" w:eastAsia="zh-CN"/>
               </w:rPr>
             </w:pPr>
+            <w:r>
+              <w:rPr>
+                <w:rFonts w:hint="eastAsia" w:ascii="宋体" w:hAnsi="宋体" w:cs="宋体"/>
+                <w:b w:val="0"/>
+                <w:bCs w:val="0"/>
+                <w:color w:val="000000"/>
+                <w:sz w:val="24"/>
+                <w:szCs w:val="24"/>
+                <w:u w:val="single"/>
+                <w:vertAlign w:val="baseline"/>
+                <w:lang w:val="en-US" w:eastAsia="zh-CN"/>
+              </w:rPr>
+              <w:t>23数据04班</w:t>
+            </w:r>
           </w:p>
         </w:tc>
       </w:tr>
@@ -493,7 +533,7 @@
             <w:pPr>
               <w:jc w:val="center"/>
               <w:rPr>
-                <w:rFonts w:hint="eastAsia" w:ascii="宋体" w:hAnsi="宋体" w:eastAsia="宋体" w:cs="宋体"/>
+                <w:rFonts w:hint="default" w:ascii="宋体" w:hAnsi="宋体" w:eastAsia="宋体" w:cs="宋体"/>
                 <w:b w:val="0"/>
                 <w:bCs w:val="0"/>
                 <w:color w:val="000000"/>
@@ -504,6 +544,20 @@
                 <w:lang w:val="en-US" w:eastAsia="zh-CN"/>
               </w:rPr>
             </w:pPr>
+            <w:r>
+              <w:rPr>
+                <w:rFonts w:hint="eastAsia" w:ascii="宋体" w:hAnsi="宋体" w:cs="宋体"/>
+                <w:b w:val="0"/>
+                <w:bCs w:val="0"/>
+                <w:color w:val="000000"/>
+                <w:sz w:val="24"/>
+                <w:szCs w:val="24"/>
+                <w:u w:val="single"/>
+                <w:vertAlign w:val="baseline"/>
+                <w:lang w:val="en-US" w:eastAsia="zh-CN"/>
+              </w:rPr>
+              <w:t>20234080420</w:t>
+            </w:r>
           </w:p>
         </w:tc>
         <w:tc>
@@ -523,7 +577,7 @@
             <w:pPr>
               <w:jc w:val="center"/>
               <w:rPr>
-                <w:rFonts w:hint="eastAsia" w:ascii="宋体" w:hAnsi="宋体" w:eastAsia="宋体" w:cs="宋体"/>
+                <w:rFonts w:hint="default" w:ascii="宋体" w:hAnsi="宋体" w:eastAsia="宋体" w:cs="宋体"/>
                 <w:b w:val="0"/>
                 <w:bCs w:val="0"/>
                 <w:color w:val="000000"/>
@@ -534,6 +588,20 @@
                 <w:lang w:val="en-US" w:eastAsia="zh-CN"/>
               </w:rPr>
             </w:pPr>
+            <w:r>
+              <w:rPr>
+                <w:rFonts w:hint="eastAsia" w:ascii="宋体" w:hAnsi="宋体" w:cs="宋体"/>
+                <w:b w:val="0"/>
+                <w:bCs w:val="0"/>
+                <w:color w:val="000000"/>
+                <w:sz w:val="24"/>
+                <w:szCs w:val="24"/>
+                <w:u w:val="single"/>
+                <w:vertAlign w:val="baseline"/>
+                <w:lang w:val="en-US" w:eastAsia="zh-CN"/>
+              </w:rPr>
+              <w:t>张竟峰</w:t>
+            </w:r>
           </w:p>
         </w:tc>
         <w:tc>
@@ -564,6 +632,20 @@
                 <w:lang w:val="en-US" w:eastAsia="zh-CN"/>
               </w:rPr>
             </w:pPr>
+            <w:r>
+              <w:rPr>
+                <w:rFonts w:hint="eastAsia" w:ascii="宋体" w:hAnsi="宋体" w:cs="宋体"/>
+                <w:b w:val="0"/>
+                <w:bCs w:val="0"/>
+                <w:color w:val="000000"/>
+                <w:sz w:val="24"/>
+                <w:szCs w:val="24"/>
+                <w:u w:val="single"/>
+                <w:vertAlign w:val="baseline"/>
+                <w:lang w:val="en-US" w:eastAsia="zh-CN"/>
+              </w:rPr>
+              <w:t>23数据04班</w:t>
+            </w:r>
           </w:p>
         </w:tc>
       </w:tr>
@@ -605,7 +687,7 @@
             <w:pPr>
               <w:jc w:val="center"/>
               <w:rPr>
-                <w:rFonts w:hint="eastAsia" w:ascii="宋体" w:hAnsi="宋体" w:eastAsia="宋体" w:cs="宋体"/>
+                <w:rFonts w:hint="default" w:ascii="宋体" w:hAnsi="宋体" w:eastAsia="宋体" w:cs="宋体"/>
                 <w:b w:val="0"/>
                 <w:bCs w:val="0"/>
                 <w:color w:val="000000"/>
@@ -616,6 +698,20 @@
                 <w:lang w:val="en-US" w:eastAsia="zh-CN"/>
               </w:rPr>
             </w:pPr>
+            <w:r>
+              <w:rPr>
+                <w:rFonts w:hint="eastAsia" w:ascii="宋体" w:hAnsi="宋体" w:cs="宋体"/>
+                <w:b w:val="0"/>
+                <w:bCs w:val="0"/>
+                <w:color w:val="000000"/>
+                <w:sz w:val="24"/>
+                <w:szCs w:val="24"/>
+                <w:u w:val="single"/>
+                <w:vertAlign w:val="baseline"/>
+                <w:lang w:val="en-US" w:eastAsia="zh-CN"/>
+              </w:rPr>
+              <w:t>20234080416</w:t>
+            </w:r>
           </w:p>
         </w:tc>
         <w:tc>
@@ -635,7 +731,7 @@
             <w:pPr>
               <w:jc w:val="center"/>
               <w:rPr>
-                <w:rFonts w:hint="eastAsia" w:ascii="宋体" w:hAnsi="宋体" w:eastAsia="宋体" w:cs="宋体"/>
+                <w:rFonts w:hint="default" w:ascii="宋体" w:hAnsi="宋体" w:eastAsia="宋体" w:cs="宋体"/>
                 <w:b w:val="0"/>
                 <w:bCs w:val="0"/>
                 <w:color w:val="000000"/>
@@ -646,6 +742,20 @@
                 <w:lang w:val="en-US" w:eastAsia="zh-CN"/>
               </w:rPr>
             </w:pPr>
+            <w:r>
+              <w:rPr>
+                <w:rFonts w:hint="eastAsia" w:ascii="宋体" w:hAnsi="宋体" w:cs="宋体"/>
+                <w:b w:val="0"/>
+                <w:bCs w:val="0"/>
+                <w:color w:val="000000"/>
+                <w:sz w:val="24"/>
+                <w:szCs w:val="24"/>
+                <w:u w:val="single"/>
+                <w:vertAlign w:val="baseline"/>
+                <w:lang w:val="en-US" w:eastAsia="zh-CN"/>
+              </w:rPr>
+              <w:t>尹士嘉</w:t>
+            </w:r>
           </w:p>
         </w:tc>
         <w:tc>
@@ -676,6 +786,20 @@
                 <w:lang w:val="en-US" w:eastAsia="zh-CN"/>
               </w:rPr>
             </w:pPr>
+            <w:r>
+              <w:rPr>
+                <w:rFonts w:hint="eastAsia" w:ascii="宋体" w:hAnsi="宋体" w:cs="宋体"/>
+                <w:b w:val="0"/>
+                <w:bCs w:val="0"/>
+                <w:color w:val="000000"/>
+                <w:sz w:val="24"/>
+                <w:szCs w:val="24"/>
+                <w:u w:val="single"/>
+                <w:vertAlign w:val="baseline"/>
+                <w:lang w:val="en-US" w:eastAsia="zh-CN"/>
+              </w:rPr>
+              <w:t>23数据04班</w:t>
+            </w:r>
           </w:p>
         </w:tc>
       </w:tr>
@@ -717,7 +841,7 @@
             <w:pPr>
               <w:jc w:val="center"/>
               <w:rPr>
-                <w:rFonts w:hint="eastAsia" w:ascii="宋体" w:hAnsi="宋体" w:eastAsia="宋体" w:cs="宋体"/>
+                <w:rFonts w:hint="default" w:ascii="宋体" w:hAnsi="宋体" w:eastAsia="宋体" w:cs="宋体"/>
                 <w:b w:val="0"/>
                 <w:bCs w:val="0"/>
                 <w:color w:val="000000"/>
@@ -728,6 +852,20 @@
                 <w:lang w:val="en-US" w:eastAsia="zh-CN"/>
               </w:rPr>
             </w:pPr>
+            <w:r>
+              <w:rPr>
+                <w:rFonts w:hint="eastAsia" w:ascii="宋体" w:hAnsi="宋体" w:cs="宋体"/>
+                <w:b w:val="0"/>
+                <w:bCs w:val="0"/>
+                <w:color w:val="000000"/>
+                <w:sz w:val="24"/>
+                <w:szCs w:val="24"/>
+                <w:u w:val="single"/>
+                <w:vertAlign w:val="baseline"/>
+                <w:lang w:val="en-US" w:eastAsia="zh-CN"/>
+              </w:rPr>
+              <w:t>20234080411</w:t>
+            </w:r>
           </w:p>
         </w:tc>
         <w:tc>
@@ -747,7 +885,7 @@
             <w:pPr>
               <w:jc w:val="center"/>
               <w:rPr>
-                <w:rFonts w:hint="eastAsia" w:ascii="宋体" w:hAnsi="宋体" w:eastAsia="宋体" w:cs="宋体"/>
+                <w:rFonts w:hint="default" w:ascii="宋体" w:hAnsi="宋体" w:eastAsia="宋体" w:cs="宋体"/>
                 <w:b w:val="0"/>
                 <w:bCs w:val="0"/>
                 <w:color w:val="000000"/>
@@ -758,6 +896,20 @@
                 <w:lang w:val="en-US" w:eastAsia="zh-CN"/>
               </w:rPr>
             </w:pPr>
+            <w:r>
+              <w:rPr>
+                <w:rFonts w:hint="eastAsia" w:ascii="宋体" w:hAnsi="宋体" w:cs="宋体"/>
+                <w:b w:val="0"/>
+                <w:bCs w:val="0"/>
+                <w:color w:val="000000"/>
+                <w:sz w:val="24"/>
+                <w:szCs w:val="24"/>
+                <w:u w:val="single"/>
+                <w:vertAlign w:val="baseline"/>
+                <w:lang w:val="en-US" w:eastAsia="zh-CN"/>
+              </w:rPr>
+              <w:t>周楷</w:t>
+            </w:r>
           </w:p>
         </w:tc>
         <w:tc>
@@ -788,6 +940,22 @@
                 <w:lang w:val="en-US" w:eastAsia="zh-CN"/>
               </w:rPr>
             </w:pPr>
+            <w:r>
+              <w:rPr>
+                <w:rFonts w:hint="eastAsia" w:ascii="宋体" w:hAnsi="宋体" w:cs="宋体"/>
+                <w:b w:val="0"/>
+                <w:bCs w:val="0"/>
+                <w:color w:val="000000"/>
+                <w:sz w:val="24"/>
+                <w:szCs w:val="24"/>
+                <w:u w:val="single"/>
+                <w:vertAlign w:val="baseline"/>
+                <w:lang w:val="en-US" w:eastAsia="zh-CN"/>
+              </w:rPr>
+              <w:t>23数据04班</w:t>
+            </w:r>
+            <w:bookmarkStart w:id="34" w:name="_GoBack"/>
+            <w:bookmarkEnd w:id="34"/>
           </w:p>
         </w:tc>
       </w:tr>
@@ -4656,12 +4824,6 @@
             <w:insideH w:val="single" w:color="auto" w:sz="4" w:space="0"/>
             <w:insideV w:val="single" w:color="auto" w:sz="4" w:space="0"/>
           </w:tblBorders>
-          <w:tblCellMar>
-            <w:top w:w="0" w:type="dxa"/>
-            <w:left w:w="108" w:type="dxa"/>
-            <w:bottom w:w="0" w:type="dxa"/>
-            <w:right w:w="108" w:type="dxa"/>
-          </w:tblCellMar>
         </w:tblPrEx>
         <w:trPr>
           <w:tblHeader/>
@@ -8199,14 +8361,6 @@
       </w:tr>
       <w:tr>
         <w:tblPrEx>
-          <w:tblBorders>
-            <w:top w:val="single" w:color="auto" w:sz="4" w:space="0"/>
-            <w:left w:val="single" w:color="auto" w:sz="4" w:space="0"/>
-            <w:bottom w:val="single" w:color="auto" w:sz="4" w:space="0"/>
-            <w:right w:val="single" w:color="auto" w:sz="4" w:space="0"/>
-            <w:insideH w:val="single" w:color="auto" w:sz="4" w:space="0"/>
-            <w:insideV w:val="single" w:color="auto" w:sz="4" w:space="0"/>
-          </w:tblBorders>
           <w:tblCellMar>
             <w:top w:w="0" w:type="dxa"/>
             <w:left w:w="108" w:type="dxa"/>

</xml_diff>